<commit_message>
Use consistent WVU DSPIRA banners on amplifier guides
</commit_message>
<xml_diff>
--- a/assembly/parts-guide-v4.docx
+++ b/assembly/parts-guide-v4.docx
@@ -2015,15 +2015,42 @@
   <w:p>
     <w:pPr>
       <w:pStyle w:val="Header"/>
+      <w:tabs>
+        <w:tab w:val="clear" w:pos="576"/>
+        <w:tab w:val="clear" w:pos="1152"/>
+        <w:tab w:val="clear" w:pos="1728"/>
+        <w:tab w:val="clear" w:pos="2304"/>
+        <w:tab w:val="clear" w:pos="2880"/>
+        <w:tab w:val="clear" w:pos="3456"/>
+        <w:tab w:val="clear" w:pos="4032"/>
+        <w:tab w:val="clear" w:pos="4680"/>
+        <w:tab w:val="clear" w:pos="9360"/>
+        <w:tab w:pos="9820" w:val="right"/>
+      </w:tabs>
+      <w:spacing w:before="0" w:after="0" w:lineRule="exact" w:line="480"/>
+      <w:shd w:val="clear" w:fill="002855"/>
+      <w:pBdr>
+        <w:bottom w:val="single" w:sz="16" w:space="0" w:color="EEAA00"/>
+      </w:pBdr>
     </w:pPr>
     <w:r>
       <w:rPr>
-        <w:rFonts w:ascii="Arial" w:hAnsi="Arial" w:cs="Arial" w:eastAsia="Arial"/>
-        <w:b/>
-        <w:color w:val="002855"/>
+        <w:rFonts w:ascii="Arial" w:hAnsi="Arial"/>
+        <w:b/>
+        <w:color w:val="FFFFFF"/>
+        <w:sz w:val="32"/>
+      </w:rPr>
+      <w:t xml:space="preserve">  WVU DSPIRA</w:t>
+    </w:r>
+    <w:r>
+      <w:rPr>
+        <w:rFonts w:ascii="Arial" w:hAnsi="Arial"/>
+        <w:b w:val="0"/>
+        <w:color w:val="FFFFFF"/>
         <w:sz w:val="18"/>
       </w:rPr>
-      <w:t>WVU DSPIRA</w:t>
+      <w:tab/>
+      <w:t>WEST VIRGINIA UNIVERSITY</w:t>
     </w:r>
   </w:p>
 </w:hdr>

</xml_diff>